<commit_message>
FINDING BEST PARAMETERS AND UPDATES ON WEBSITE AND MOBILE APP
</commit_message>
<xml_diff>
--- a/Laporan/IMPLEMENTASI MODEL LSTM UNTUK PREDIKSI HARGA KOMODITAS PANGAN BERBASIS WEB DI PROVINSI JAWA TENGAH.docx
+++ b/Laporan/IMPLEMENTASI MODEL LSTM UNTUK PREDIKSI HARGA KOMODITAS PANGAN BERBASIS WEB DI PROVINSI JAWA TENGAH.docx
@@ -8602,6 +8602,16 @@
         <w:pStyle w:val="Heading3"/>
       </w:pPr>
       <w:r>
+        <w:t>Computer Vision dan MobileNetV2</w:t>
+      </w:r>
+    </w:p>
+    <w:p/>
+    <w:p>
+      <w:pPr>
+        <w:pStyle w:val="Heading3"/>
+      </w:pPr>
+      <w:r>
+        <w:lastRenderedPageBreak/>
         <w:t>Pra-pemrosesan Data (</w:t>
       </w:r>
       <w:r>
@@ -8681,7 +8691,6 @@
         <w:pStyle w:val="ListParagraph"/>
       </w:pPr>
       <w:r>
-        <w:lastRenderedPageBreak/>
         <w:t xml:space="preserve">LSTM beroperasi dengan perkalian metriks secara berulang menggunakan fungsi derivatif seperti </w:t>
       </w:r>
       <w:r>
@@ -9144,6 +9153,7 @@
           <w:i/>
           <w:iCs/>
         </w:rPr>
+        <w:lastRenderedPageBreak/>
         <w:t>Mean Absolute Error</w:t>
       </w:r>
       <w:r>
@@ -9159,11 +9169,7 @@
         <w:t>Mean Absolute Error</w:t>
       </w:r>
       <w:r>
-        <w:t xml:space="preserve"> (MAE) adalah metriks evaluasi statistik yang digunakan untuk mengukur tingkat keakuratan sebuah model peramalan dengan menghitung rata-rata dari nilau absolut selisih antara nilai prediksi dan nilai aktual. Penggunaan nilai absolut dalam MAE memastikan bahwa kesalahan bernilai negatif (prediksi </w:t>
-      </w:r>
-      <w:r>
-        <w:lastRenderedPageBreak/>
-        <w:t xml:space="preserve">terlalu rendah) dan kesalahan bernilai poditif (prediksi terlalu tinggi) tidak saling meniadakan saat dijumlahkan. Semakin kecil MAE yang dihasilkan, maka semakin baik dan akurat model komputasi tersebut dalam mengikuti pola aktual </w:t>
+        <w:t xml:space="preserve"> (MAE) adalah metriks evaluasi statistik yang digunakan untuk mengukur tingkat keakuratan sebuah model peramalan dengan menghitung rata-rata dari nilau absolut selisih antara nilai prediksi dan nilai aktual. Penggunaan nilai absolut dalam MAE memastikan bahwa kesalahan bernilai negatif (prediksi terlalu rendah) dan kesalahan bernilai poditif (prediksi terlalu tinggi) tidak saling meniadakan saat dijumlahkan. Semakin kecil MAE yang dihasilkan, maka semakin baik dan akurat model komputasi tersebut dalam mengikuti pola aktual </w:t>
       </w:r>
       <w:r>
         <w:fldChar w:fldCharType="begin"/>
@@ -9573,7 +9579,11 @@
         <w:t>Root Mean Square Error</w:t>
       </w:r>
       <w:r>
-        <w:t xml:space="preserve"> (RMSE) adalah teknik metrik evaluasi komparatif yang menghitung akar kuadrat dari rata-rata kuadrat selisih antara nilai aktual di lapangan dan nilai yang diproyeksikan oleh model. Berbeda dengan MAE yang memperlakukan semua galat secara proporsional, RMSE bekerja dahulu menguadratkan setiap nilai deviasi sebelum dirata-ratakan. Mekanisme matematis ini memberikan penalti atau bobot kesalahan yang jauh lebih besar terhadap prediksi yang menyimpang sangat jauh dari nilai sebenarnya </w:t>
+        <w:t xml:space="preserve"> (RMSE) adalah teknik metrik evaluasi komparatif yang menghitung akar kuadrat dari rata-rata kuadrat selisih antara nilai aktual di lapangan dan nilai yang diproyeksikan oleh model. Berbeda dengan MAE yang memperlakukan semua galat secara proporsional, RMSE bekerja dahulu menguadratkan setiap nilai deviasi sebelum dirata-ratakan. Mekanisme matematis </w:t>
+      </w:r>
+      <w:r>
+        <w:lastRenderedPageBreak/>
+        <w:t xml:space="preserve">ini memberikan penalti atau bobot kesalahan yang jauh lebih besar terhadap prediksi yang menyimpang sangat jauh dari nilai sebenarnya </w:t>
       </w:r>
       <w:r>
         <w:fldChar w:fldCharType="begin"/>
@@ -9599,11 +9609,7 @@
     </w:p>
     <w:p>
       <w:r>
-        <w:t xml:space="preserve">Dalam konteks prediksi harga komoditas pangan yang sering kali mengalami fluktuasi tajam atau guncangan pasar mendadak, RMSE menjadi instrumen validasi </w:t>
-      </w:r>
-      <w:r>
-        <w:lastRenderedPageBreak/>
-        <w:t xml:space="preserve">yang krusial. Apabila model LSTM gagal beradaptasi </w:t>
+        <w:t xml:space="preserve">Dalam konteks prediksi harga komoditas pangan yang sering kali mengalami fluktuasi tajam atau guncangan pasar mendadak, RMSE menjadi instrumen validasi yang krusial. Apabila model LSTM gagal beradaptasi </w:t>
       </w:r>
       <w:r>
         <w:t xml:space="preserve">terhadap lonjakan ekstrem, nilai RMSE yang dihasilkan akan membengkak secara signifikan. Model dinyatakan berkinerja unggul apabila nilai RMSE yang dihasilkan tereduksi mendekati angka nol </w:t>
@@ -10019,10 +10025,7 @@
         <w:t xml:space="preserve">Mean Absolute Percentage Error </w:t>
       </w:r>
       <w:r>
-        <w:t>(MAPE</w:t>
-      </w:r>
-      <w:r>
-        <w:t>) adalah evaluasi performa model yang merangkum rata-rata selisih absolut antara nilai aktual dan nilai prediksi dan direpresentaasikan dalam bentuk persentase (%). Keunggulan utama MAPE yang membedakannya dari MAE atau RMSE adalah kemampuannya yang bersifat independen terhadap skala asal metrik data (</w:t>
+        <w:t>(MAPE) adalah evaluasi performa model yang merangkum rata-rata selisih absolut antara nilai aktual dan nilai prediksi dan direpresentaasikan dalam bentuk persentase (%). Keunggulan utama MAPE yang membedakannya dari MAE atau RMSE adalah kemampuannya yang bersifat independen terhadap skala asal metrik data (</w:t>
       </w:r>
       <w:r>
         <w:rPr>
@@ -10061,7 +10064,11 @@
         <w:fldChar w:fldCharType="end"/>
       </w:r>
       <w:r>
-        <w:t xml:space="preserve">. Sebagai contoh, nilai MAPE sebesar 10% memiliki arti bahwa selisih rata-rata keseluruhan prediksi sistem dengan harga komoditas asli hanya 10%. Nilai dibawah 10% diklasifikasikan sebagai prediksi sangat akurat, nilai 10-20% dinilai sebagai prediksi yang baik/layak, 20-50% dipandang cukup, sedangkan nilai diatas 50% dianggap sebagai model gagal atau tidak akurat </w:t>
+        <w:t xml:space="preserve">. Sebagai contoh, nilai MAPE sebesar 10% memiliki arti bahwa selisih rata-rata keseluruhan prediksi sistem dengan harga </w:t>
+      </w:r>
+      <w:r>
+        <w:lastRenderedPageBreak/>
+        <w:t xml:space="preserve">komoditas asli hanya 10%. Nilai dibawah 10% diklasifikasikan sebagai prediksi sangat akurat, nilai 10-20% dinilai sebagai prediksi yang baik/layak, 20-50% dipandang cukup, sedangkan nilai diatas 50% dianggap sebagai model gagal atau tidak akurat </w:t>
       </w:r>
       <w:r>
         <w:fldChar w:fldCharType="begin"/>
@@ -10082,19 +10089,7 @@
         <w:fldChar w:fldCharType="end"/>
       </w:r>
       <w:r>
-        <w:t xml:space="preserve">. </w:t>
-      </w:r>
-      <w:r>
-        <w:t xml:space="preserve">Rumus matematis </w:t>
-      </w:r>
-      <w:r>
-        <w:t>MAPE</w:t>
-      </w:r>
-      <w:r>
-        <w:t xml:space="preserve"> dinyatakan sebagai berikut</w:t>
-      </w:r>
-      <w:r>
-        <w:t xml:space="preserve">: </w:t>
+        <w:t xml:space="preserve">. Rumus matematis MAPE dinyatakan sebagai berikut: </w:t>
       </w:r>
     </w:p>
     <w:p>
@@ -10111,7 +10106,6 @@
             <w:rPr>
               <w:rFonts w:ascii="Cambria Math" w:hAnsi="Cambria Math"/>
             </w:rPr>
-            <w:lastRenderedPageBreak/>
             <m:t>MAPE=</m:t>
           </m:r>
           <m:f>
@@ -10352,10 +10346,7 @@
         </w:rPr>
       </w:pPr>
       <w:r>
-        <w:t>MAPE</w:t>
-      </w:r>
-      <w:r>
-        <w:t xml:space="preserve"> = Nilai </w:t>
+        <w:t xml:space="preserve">MAPE = Nilai </w:t>
       </w:r>
       <w:r>
         <w:rPr>
@@ -10531,7 +10522,10 @@
         <w:fldChar w:fldCharType="end"/>
       </w:r>
       <w:r>
-        <w:t xml:space="preserve">. </w:t>
+        <w:t>.</w:t>
+      </w:r>
+      <w:r>
+        <w:t xml:space="preserve"> </w:t>
       </w:r>
     </w:p>
     <w:sectPr>
@@ -14425,6 +14419,7 @@
   <w:style w:type="character" w:default="1" w:styleId="DefaultParagraphFont">
     <w:name w:val="Default Paragraph Font"/>
     <w:uiPriority w:val="1"/>
+    <w:semiHidden/>
     <w:unhideWhenUsed/>
   </w:style>
   <w:style w:type="table" w:default="1" w:styleId="TableNormal">

</xml_diff>